<commit_message>
Update 周二 2026/08/25 22:08:46
</commit_message>
<xml_diff>
--- a/模板库/ku/奇瑞.docx
+++ b/模板库/ku/奇瑞.docx
@@ -1088,32 +1088,30 @@
           <w:lang w:val="en-US" w:eastAsia="zh-CN"/>
         </w:rPr>
       </w:pPr>
+      <w:r>
+        <w:rPr>
+          <w:rFonts w:hint="eastAsia" w:ascii="宋体" w:hAnsi="宋体" w:eastAsia="宋体" w:cs="宋体"/>
+          <w:b w:val="0"/>
+          <w:bCs/>
+          <w:color w:val="auto"/>
+          <w:sz w:val="21"/>
+          <w:szCs w:val="21"/>
+          <w:lang w:val="en-US" w:eastAsia="zh-CN"/>
+        </w:rPr>
+        <w:br w:type="page"/>
+      </w:r>
+      <w:r>
+        <w:rPr>
+          <w:rFonts w:hint="eastAsia" w:ascii="宋体" w:hAnsi="宋体" w:eastAsia="宋体" w:cs="宋体"/>
+          <w:b/>
+          <w:sz w:val="24"/>
+          <w:szCs w:val="24"/>
+          <w:lang w:val="en-US" w:eastAsia="zh-CN"/>
+        </w:rPr>
+        <w:t>● 功能状态分级</w:t>
+      </w:r>
       <w:bookmarkStart w:id="0" w:name="_GoBack"/>
       <w:bookmarkEnd w:id="0"/>
-      <w:r>
-        <w:rPr>
-          <w:rFonts w:hint="eastAsia" w:ascii="宋体" w:hAnsi="宋体" w:eastAsia="宋体" w:cs="宋体"/>
-          <w:b w:val="0"/>
-          <w:bCs/>
-          <w:color w:val="auto"/>
-          <w:sz w:val="21"/>
-          <w:szCs w:val="21"/>
-          <w:lang w:val="en-US" w:eastAsia="zh-CN"/>
-        </w:rPr>
-        <w:br w:type="page"/>
-      </w:r>
-      <w:r>
-        <w:rPr>
-          <w:rFonts w:hint="eastAsia" w:ascii="宋体" w:hAnsi="宋体" w:eastAsia="宋体" w:cs="宋体"/>
-          <w:b w:val="0"/>
-          <w:bCs/>
-          <w:color w:val="auto"/>
-          <w:sz w:val="21"/>
-          <w:szCs w:val="21"/>
-          <w:lang w:val="en-US" w:eastAsia="zh-CN"/>
-        </w:rPr>
-        <w:t>● 功能状态分级</w:t>
-      </w:r>
     </w:p>
     <w:p>
       <w:pPr>

</xml_diff>

<commit_message>
Update 周三 2026/08/26 11:13:01
</commit_message>
<xml_diff>
--- a/模板库/ku/奇瑞.docx
+++ b/模板库/ku/奇瑞.docx
@@ -212,33 +212,85 @@
           <w:szCs w:val="21"/>
           <w:lang w:val="en-US" w:eastAsia="zh-CN"/>
         </w:rPr>
-        <w:t>当车辆发动机关闭,且所有电气连接完好,零部件以电压UB带电运行。</w:t>
-      </w:r>
-    </w:p>
-    <w:p>
-      <w:pPr>
-        <w:spacing w:line="360" w:lineRule="auto"/>
-        <w:rPr>
-          <w:rFonts w:hint="eastAsia" w:ascii="宋体" w:hAnsi="宋体" w:eastAsia="宋体" w:cs="宋体"/>
-          <w:b w:val="0"/>
-          <w:bCs/>
-          <w:color w:val="auto"/>
-          <w:sz w:val="21"/>
-          <w:szCs w:val="21"/>
-          <w:lang w:val="en-US" w:eastAsia="zh-CN"/>
-        </w:rPr>
-      </w:pPr>
-      <w:r>
-        <w:rPr>
-          <w:rFonts w:hint="eastAsia" w:ascii="宋体" w:hAnsi="宋体" w:eastAsia="宋体" w:cs="宋体"/>
-          <w:b w:val="0"/>
-          <w:bCs/>
-          <w:color w:val="auto"/>
-          <w:sz w:val="21"/>
-          <w:szCs w:val="21"/>
-          <w:lang w:val="en-US" w:eastAsia="zh-CN"/>
-        </w:rPr>
-        <w:t>工作模式2.1:系统/组件带电压UB运行但功能不被激活(如休眠模式:即串行数据通信未激活或零</w:t>
+        <w:t>当车辆发动机关闭,且所有电气连接完好,零部件以电压U</w:t>
+      </w:r>
+      <w:r>
+        <w:rPr>
+          <w:rFonts w:hint="eastAsia" w:ascii="宋体" w:hAnsi="宋体" w:eastAsia="宋体" w:cs="宋体"/>
+          <w:b w:val="0"/>
+          <w:bCs/>
+          <w:color w:val="auto"/>
+          <w:sz w:val="21"/>
+          <w:szCs w:val="21"/>
+          <w:vertAlign w:val="subscript"/>
+          <w:lang w:val="en-US" w:eastAsia="zh-CN"/>
+        </w:rPr>
+        <w:t>B</w:t>
+      </w:r>
+      <w:bookmarkStart w:id="0" w:name="_GoBack"/>
+      <w:bookmarkEnd w:id="0"/>
+      <w:r>
+        <w:rPr>
+          <w:rFonts w:hint="eastAsia" w:ascii="宋体" w:hAnsi="宋体" w:eastAsia="宋体" w:cs="宋体"/>
+          <w:b w:val="0"/>
+          <w:bCs/>
+          <w:color w:val="auto"/>
+          <w:sz w:val="21"/>
+          <w:szCs w:val="21"/>
+          <w:lang w:val="en-US" w:eastAsia="zh-CN"/>
+        </w:rPr>
+        <w:t>带电运行。</w:t>
+      </w:r>
+    </w:p>
+    <w:p>
+      <w:pPr>
+        <w:spacing w:line="360" w:lineRule="auto"/>
+        <w:rPr>
+          <w:rFonts w:hint="eastAsia" w:ascii="宋体" w:hAnsi="宋体" w:eastAsia="宋体" w:cs="宋体"/>
+          <w:b w:val="0"/>
+          <w:bCs/>
+          <w:color w:val="auto"/>
+          <w:sz w:val="21"/>
+          <w:szCs w:val="21"/>
+          <w:lang w:val="en-US" w:eastAsia="zh-CN"/>
+        </w:rPr>
+      </w:pPr>
+      <w:r>
+        <w:rPr>
+          <w:rFonts w:hint="eastAsia" w:ascii="宋体" w:hAnsi="宋体" w:eastAsia="宋体" w:cs="宋体"/>
+          <w:b w:val="0"/>
+          <w:bCs/>
+          <w:color w:val="auto"/>
+          <w:sz w:val="21"/>
+          <w:szCs w:val="21"/>
+          <w:lang w:val="en-US" w:eastAsia="zh-CN"/>
+        </w:rPr>
+        <w:t>工作模式2.1:系统/组件带电压U</w:t>
+      </w:r>
+      <w:r>
+        <w:rPr>
+          <w:rFonts w:hint="eastAsia" w:ascii="宋体" w:hAnsi="宋体" w:eastAsia="宋体" w:cs="宋体"/>
+          <w:b w:val="0"/>
+          <w:bCs/>
+          <w:color w:val="auto"/>
+          <w:sz w:val="21"/>
+          <w:szCs w:val="21"/>
+          <w:vertAlign w:val="subscript"/>
+          <w:lang w:val="en-US" w:eastAsia="zh-CN"/>
+        </w:rPr>
+        <w:t>B</w:t>
+      </w:r>
+      <w:r>
+        <w:rPr>
+          <w:rFonts w:hint="eastAsia" w:ascii="宋体" w:hAnsi="宋体" w:eastAsia="宋体" w:cs="宋体"/>
+          <w:b w:val="0"/>
+          <w:bCs/>
+          <w:color w:val="auto"/>
+          <w:sz w:val="21"/>
+          <w:szCs w:val="21"/>
+          <w:lang w:val="en-US" w:eastAsia="zh-CN"/>
+        </w:rPr>
+        <w:t>运行但功能不被激活(如休眠模式:即串行数据通信未激活或零</w:t>
       </w:r>
     </w:p>
     <w:p>
@@ -290,33 +342,83 @@
           <w:szCs w:val="21"/>
           <w:lang w:val="en-US" w:eastAsia="zh-CN"/>
         </w:rPr>
-        <w:t>工作模式2.2:系统/组件带电压UB运行并控制在典型运行模式(如需要带载荷,通常为额定载荷)。</w:t>
-      </w:r>
-    </w:p>
-    <w:p>
-      <w:pPr>
-        <w:spacing w:line="360" w:lineRule="auto"/>
-        <w:rPr>
-          <w:rFonts w:hint="eastAsia" w:ascii="宋体" w:hAnsi="宋体" w:eastAsia="宋体" w:cs="宋体"/>
-          <w:b w:val="0"/>
-          <w:bCs/>
-          <w:color w:val="auto"/>
-          <w:sz w:val="21"/>
-          <w:szCs w:val="21"/>
-          <w:lang w:val="en-US" w:eastAsia="zh-CN"/>
-        </w:rPr>
-      </w:pPr>
-      <w:r>
-        <w:rPr>
-          <w:rFonts w:hint="eastAsia" w:ascii="宋体" w:hAnsi="宋体" w:eastAsia="宋体" w:cs="宋体"/>
-          <w:b w:val="0"/>
-          <w:bCs/>
-          <w:color w:val="auto"/>
-          <w:sz w:val="21"/>
-          <w:szCs w:val="21"/>
-          <w:lang w:val="en-US" w:eastAsia="zh-CN"/>
-        </w:rPr>
-        <w:t>工作模式2.3:系统/组件带电压UB运行并控制在最小负载运行模式(如需要带载荷,通常为最小</w:t>
+        <w:t>工作模式2.2:系统/组件带电压U</w:t>
+      </w:r>
+      <w:r>
+        <w:rPr>
+          <w:rFonts w:hint="eastAsia" w:ascii="宋体" w:hAnsi="宋体" w:eastAsia="宋体" w:cs="宋体"/>
+          <w:b w:val="0"/>
+          <w:bCs/>
+          <w:color w:val="auto"/>
+          <w:sz w:val="21"/>
+          <w:szCs w:val="21"/>
+          <w:vertAlign w:val="subscript"/>
+          <w:lang w:val="en-US" w:eastAsia="zh-CN"/>
+        </w:rPr>
+        <w:t>B</w:t>
+      </w:r>
+      <w:r>
+        <w:rPr>
+          <w:rFonts w:hint="eastAsia" w:ascii="宋体" w:hAnsi="宋体" w:eastAsia="宋体" w:cs="宋体"/>
+          <w:b w:val="0"/>
+          <w:bCs/>
+          <w:color w:val="auto"/>
+          <w:sz w:val="21"/>
+          <w:szCs w:val="21"/>
+          <w:lang w:val="en-US" w:eastAsia="zh-CN"/>
+        </w:rPr>
+        <w:t>运行并控制在典型运行模式(如需要带载荷,通常为额定载荷)。</w:t>
+      </w:r>
+    </w:p>
+    <w:p>
+      <w:pPr>
+        <w:spacing w:line="360" w:lineRule="auto"/>
+        <w:rPr>
+          <w:rFonts w:hint="eastAsia" w:ascii="宋体" w:hAnsi="宋体" w:eastAsia="宋体" w:cs="宋体"/>
+          <w:b w:val="0"/>
+          <w:bCs/>
+          <w:color w:val="auto"/>
+          <w:sz w:val="21"/>
+          <w:szCs w:val="21"/>
+          <w:lang w:val="en-US" w:eastAsia="zh-CN"/>
+        </w:rPr>
+      </w:pPr>
+      <w:r>
+        <w:rPr>
+          <w:rFonts w:hint="eastAsia" w:ascii="宋体" w:hAnsi="宋体" w:eastAsia="宋体" w:cs="宋体"/>
+          <w:b w:val="0"/>
+          <w:bCs/>
+          <w:color w:val="auto"/>
+          <w:sz w:val="21"/>
+          <w:szCs w:val="21"/>
+          <w:lang w:val="en-US" w:eastAsia="zh-CN"/>
+        </w:rPr>
+        <w:t>工作模式2.3:系统/组件带电压U</w:t>
+      </w:r>
+      <w:r>
+        <w:rPr>
+          <w:rFonts w:hint="eastAsia" w:ascii="宋体" w:hAnsi="宋体" w:eastAsia="宋体" w:cs="宋体"/>
+          <w:b w:val="0"/>
+          <w:bCs/>
+          <w:color w:val="auto"/>
+          <w:sz w:val="21"/>
+          <w:szCs w:val="21"/>
+          <w:vertAlign w:val="subscript"/>
+          <w:lang w:val="en-US" w:eastAsia="zh-CN"/>
+        </w:rPr>
+        <w:t>B</w:t>
+      </w:r>
+      <w:r>
+        <w:rPr>
+          <w:rFonts w:hint="eastAsia" w:ascii="宋体" w:hAnsi="宋体" w:eastAsia="宋体" w:cs="宋体"/>
+          <w:b w:val="0"/>
+          <w:bCs/>
+          <w:color w:val="auto"/>
+          <w:sz w:val="21"/>
+          <w:szCs w:val="21"/>
+          <w:lang w:val="en-US" w:eastAsia="zh-CN"/>
+        </w:rPr>
+        <w:t>运行并控制在最小负载运行模式(如需要带载荷,通常为最小</w:t>
       </w:r>
     </w:p>
     <w:p>
@@ -368,7 +470,32 @@
           <w:szCs w:val="21"/>
           <w:lang w:val="en-US" w:eastAsia="zh-CN"/>
         </w:rPr>
-        <w:t>工作模式2.4:系统/组件带电压UB运行并控制在最大负载运行模式(如需要带载荷,通常为最大</w:t>
+        <w:t>工作模式2.4:系统/组件带电压U</w:t>
+      </w:r>
+      <w:r>
+        <w:rPr>
+          <w:rFonts w:hint="eastAsia" w:ascii="宋体" w:hAnsi="宋体" w:eastAsia="宋体" w:cs="宋体"/>
+          <w:b w:val="0"/>
+          <w:bCs/>
+          <w:color w:val="auto"/>
+          <w:sz w:val="21"/>
+          <w:szCs w:val="21"/>
+          <w:vertAlign w:val="subscript"/>
+          <w:lang w:val="en-US" w:eastAsia="zh-CN"/>
+        </w:rPr>
+        <w:t>B</w:t>
+      </w:r>
+      <w:r>
+        <w:rPr>
+          <w:rFonts w:hint="eastAsia" w:ascii="宋体" w:hAnsi="宋体" w:eastAsia="宋体" w:cs="宋体"/>
+          <w:b w:val="0"/>
+          <w:bCs/>
+          <w:color w:val="auto"/>
+          <w:sz w:val="21"/>
+          <w:szCs w:val="21"/>
+          <w:lang w:val="en-US" w:eastAsia="zh-CN"/>
+        </w:rPr>
+        <w:t>运行并控制在最大负载运行模式(如需要带载荷,通常为最大</w:t>
       </w:r>
     </w:p>
     <w:p>
@@ -460,59 +587,209 @@
           <w:szCs w:val="21"/>
           <w:lang w:val="en-US" w:eastAsia="zh-CN"/>
         </w:rPr>
-        <w:t>所有电气连接完好,零部件以电压UA和UNHV带电运行。仅适用于没有辅助设备(例如冷却系统)</w:t>
-      </w:r>
-    </w:p>
-    <w:p>
-      <w:pPr>
-        <w:spacing w:line="360" w:lineRule="auto"/>
-        <w:rPr>
-          <w:rFonts w:hint="eastAsia" w:ascii="宋体" w:hAnsi="宋体" w:eastAsia="宋体" w:cs="宋体"/>
-          <w:b w:val="0"/>
-          <w:bCs/>
-          <w:color w:val="auto"/>
-          <w:sz w:val="21"/>
-          <w:szCs w:val="21"/>
-          <w:lang w:val="en-US" w:eastAsia="zh-CN"/>
-        </w:rPr>
-      </w:pPr>
-      <w:r>
-        <w:rPr>
-          <w:rFonts w:hint="eastAsia" w:ascii="宋体" w:hAnsi="宋体" w:eastAsia="宋体" w:cs="宋体"/>
-          <w:b w:val="0"/>
-          <w:bCs/>
-          <w:color w:val="auto"/>
-          <w:sz w:val="21"/>
-          <w:szCs w:val="21"/>
-          <w:lang w:val="en-US" w:eastAsia="zh-CN"/>
-        </w:rPr>
-        <w:t>工作模式3.1:系统/组件带电压UA和UNHV运行但功能不被激活。</w:t>
-      </w:r>
-    </w:p>
-    <w:p>
-      <w:pPr>
-        <w:spacing w:line="360" w:lineRule="auto"/>
-        <w:rPr>
-          <w:rFonts w:hint="eastAsia" w:ascii="宋体" w:hAnsi="宋体" w:eastAsia="宋体" w:cs="宋体"/>
-          <w:b w:val="0"/>
-          <w:bCs/>
-          <w:color w:val="auto"/>
-          <w:sz w:val="21"/>
-          <w:szCs w:val="21"/>
-          <w:lang w:val="en-US" w:eastAsia="zh-CN"/>
-        </w:rPr>
-      </w:pPr>
-      <w:r>
-        <w:rPr>
-          <w:rFonts w:hint="eastAsia" w:ascii="宋体" w:hAnsi="宋体" w:eastAsia="宋体" w:cs="宋体"/>
-          <w:b w:val="0"/>
-          <w:bCs/>
-          <w:color w:val="auto"/>
-          <w:sz w:val="21"/>
-          <w:szCs w:val="21"/>
-          <w:lang w:val="en-US" w:eastAsia="zh-CN"/>
-        </w:rPr>
-        <w:t>工作模式3.2:系统/组件带电压UA和UNiv运行并控制在典型运行模式(如需要带载荷,通常为额定</w:t>
+        <w:t>所有电气连接完好,零部件以电压U</w:t>
+      </w:r>
+      <w:r>
+        <w:rPr>
+          <w:rFonts w:hint="eastAsia" w:ascii="宋体" w:hAnsi="宋体" w:cs="宋体"/>
+          <w:b w:val="0"/>
+          <w:bCs/>
+          <w:color w:val="auto"/>
+          <w:sz w:val="21"/>
+          <w:szCs w:val="21"/>
+          <w:vertAlign w:val="subscript"/>
+          <w:lang w:val="en-US" w:eastAsia="zh-CN"/>
+        </w:rPr>
+        <w:t>A</w:t>
+      </w:r>
+      <w:r>
+        <w:rPr>
+          <w:rFonts w:hint="eastAsia" w:ascii="宋体" w:hAnsi="宋体" w:eastAsia="宋体" w:cs="宋体"/>
+          <w:b w:val="0"/>
+          <w:bCs/>
+          <w:color w:val="auto"/>
+          <w:sz w:val="21"/>
+          <w:szCs w:val="21"/>
+          <w:lang w:val="en-US" w:eastAsia="zh-CN"/>
+        </w:rPr>
+        <w:t>和U</w:t>
+      </w:r>
+      <w:r>
+        <w:rPr>
+          <w:rFonts w:hint="eastAsia" w:ascii="宋体" w:hAnsi="宋体" w:eastAsia="宋体" w:cs="宋体"/>
+          <w:b w:val="0"/>
+          <w:bCs/>
+          <w:color w:val="auto"/>
+          <w:sz w:val="21"/>
+          <w:szCs w:val="21"/>
+          <w:vertAlign w:val="subscript"/>
+          <w:lang w:val="en-US" w:eastAsia="zh-CN"/>
+        </w:rPr>
+        <w:t>NHV</w:t>
+      </w:r>
+      <w:r>
+        <w:rPr>
+          <w:rFonts w:hint="eastAsia" w:ascii="宋体" w:hAnsi="宋体" w:eastAsia="宋体" w:cs="宋体"/>
+          <w:b w:val="0"/>
+          <w:bCs/>
+          <w:color w:val="auto"/>
+          <w:sz w:val="21"/>
+          <w:szCs w:val="21"/>
+          <w:lang w:val="en-US" w:eastAsia="zh-CN"/>
+        </w:rPr>
+        <w:t>带电运行。仅适用于没有辅助设备(例如冷却系统)</w:t>
+      </w:r>
+    </w:p>
+    <w:p>
+      <w:pPr>
+        <w:spacing w:line="360" w:lineRule="auto"/>
+        <w:rPr>
+          <w:rFonts w:hint="eastAsia" w:ascii="宋体" w:hAnsi="宋体" w:eastAsia="宋体" w:cs="宋体"/>
+          <w:b w:val="0"/>
+          <w:bCs/>
+          <w:color w:val="auto"/>
+          <w:sz w:val="21"/>
+          <w:szCs w:val="21"/>
+          <w:lang w:val="en-US" w:eastAsia="zh-CN"/>
+        </w:rPr>
+      </w:pPr>
+      <w:r>
+        <w:rPr>
+          <w:rFonts w:hint="eastAsia" w:ascii="宋体" w:hAnsi="宋体" w:eastAsia="宋体" w:cs="宋体"/>
+          <w:b w:val="0"/>
+          <w:bCs/>
+          <w:color w:val="auto"/>
+          <w:sz w:val="21"/>
+          <w:szCs w:val="21"/>
+          <w:lang w:val="en-US" w:eastAsia="zh-CN"/>
+        </w:rPr>
+        <w:t>工作模式3.1:系统/组件带电压U</w:t>
+      </w:r>
+      <w:r>
+        <w:rPr>
+          <w:rFonts w:hint="eastAsia" w:ascii="宋体" w:hAnsi="宋体" w:cs="宋体"/>
+          <w:b w:val="0"/>
+          <w:bCs/>
+          <w:color w:val="auto"/>
+          <w:sz w:val="21"/>
+          <w:szCs w:val="21"/>
+          <w:vertAlign w:val="subscript"/>
+          <w:lang w:val="en-US" w:eastAsia="zh-CN"/>
+        </w:rPr>
+        <w:t>A</w:t>
+      </w:r>
+      <w:r>
+        <w:rPr>
+          <w:rFonts w:hint="eastAsia" w:ascii="宋体" w:hAnsi="宋体" w:eastAsia="宋体" w:cs="宋体"/>
+          <w:b w:val="0"/>
+          <w:bCs/>
+          <w:color w:val="auto"/>
+          <w:sz w:val="21"/>
+          <w:szCs w:val="21"/>
+          <w:lang w:val="en-US" w:eastAsia="zh-CN"/>
+        </w:rPr>
+        <w:t>和U</w:t>
+      </w:r>
+      <w:r>
+        <w:rPr>
+          <w:rFonts w:hint="eastAsia" w:ascii="宋体" w:hAnsi="宋体" w:eastAsia="宋体" w:cs="宋体"/>
+          <w:b w:val="0"/>
+          <w:bCs/>
+          <w:color w:val="auto"/>
+          <w:sz w:val="21"/>
+          <w:szCs w:val="21"/>
+          <w:vertAlign w:val="subscript"/>
+          <w:lang w:val="en-US" w:eastAsia="zh-CN"/>
+        </w:rPr>
+        <w:t>NHV</w:t>
+      </w:r>
+      <w:r>
+        <w:rPr>
+          <w:rFonts w:hint="eastAsia" w:ascii="宋体" w:hAnsi="宋体" w:eastAsia="宋体" w:cs="宋体"/>
+          <w:b w:val="0"/>
+          <w:bCs/>
+          <w:color w:val="auto"/>
+          <w:sz w:val="21"/>
+          <w:szCs w:val="21"/>
+          <w:lang w:val="en-US" w:eastAsia="zh-CN"/>
+        </w:rPr>
+        <w:t>运行但功能不被激活。</w:t>
+      </w:r>
+    </w:p>
+    <w:p>
+      <w:pPr>
+        <w:spacing w:line="360" w:lineRule="auto"/>
+        <w:rPr>
+          <w:rFonts w:hint="eastAsia" w:ascii="宋体" w:hAnsi="宋体" w:eastAsia="宋体" w:cs="宋体"/>
+          <w:b w:val="0"/>
+          <w:bCs/>
+          <w:color w:val="auto"/>
+          <w:sz w:val="21"/>
+          <w:szCs w:val="21"/>
+          <w:lang w:val="en-US" w:eastAsia="zh-CN"/>
+        </w:rPr>
+      </w:pPr>
+      <w:r>
+        <w:rPr>
+          <w:rFonts w:hint="eastAsia" w:ascii="宋体" w:hAnsi="宋体" w:eastAsia="宋体" w:cs="宋体"/>
+          <w:b w:val="0"/>
+          <w:bCs/>
+          <w:color w:val="auto"/>
+          <w:sz w:val="21"/>
+          <w:szCs w:val="21"/>
+          <w:lang w:val="en-US" w:eastAsia="zh-CN"/>
+        </w:rPr>
+        <w:t>工作模式3.2:系统/组件带电压U</w:t>
+      </w:r>
+      <w:r>
+        <w:rPr>
+          <w:rFonts w:hint="eastAsia" w:ascii="宋体" w:hAnsi="宋体" w:eastAsia="宋体" w:cs="宋体"/>
+          <w:b w:val="0"/>
+          <w:bCs/>
+          <w:color w:val="auto"/>
+          <w:sz w:val="21"/>
+          <w:szCs w:val="21"/>
+          <w:vertAlign w:val="subscript"/>
+          <w:lang w:val="en-US" w:eastAsia="zh-CN"/>
+        </w:rPr>
+        <w:t>A</w:t>
+      </w:r>
+      <w:r>
+        <w:rPr>
+          <w:rFonts w:hint="eastAsia" w:ascii="宋体" w:hAnsi="宋体" w:eastAsia="宋体" w:cs="宋体"/>
+          <w:b w:val="0"/>
+          <w:bCs/>
+          <w:color w:val="auto"/>
+          <w:sz w:val="21"/>
+          <w:szCs w:val="21"/>
+          <w:lang w:val="en-US" w:eastAsia="zh-CN"/>
+        </w:rPr>
+        <w:t>和U</w:t>
+      </w:r>
+      <w:r>
+        <w:rPr>
+          <w:rFonts w:hint="eastAsia" w:ascii="宋体" w:hAnsi="宋体" w:eastAsia="宋体" w:cs="宋体"/>
+          <w:b w:val="0"/>
+          <w:bCs/>
+          <w:color w:val="auto"/>
+          <w:sz w:val="21"/>
+          <w:szCs w:val="21"/>
+          <w:vertAlign w:val="subscript"/>
+          <w:lang w:val="en-US" w:eastAsia="zh-CN"/>
+        </w:rPr>
+        <w:t>Niv</w:t>
+      </w:r>
+      <w:r>
+        <w:rPr>
+          <w:rFonts w:hint="eastAsia" w:ascii="宋体" w:hAnsi="宋体" w:eastAsia="宋体" w:cs="宋体"/>
+          <w:b w:val="0"/>
+          <w:bCs/>
+          <w:color w:val="auto"/>
+          <w:sz w:val="21"/>
+          <w:szCs w:val="21"/>
+          <w:lang w:val="en-US" w:eastAsia="zh-CN"/>
+        </w:rPr>
+        <w:t>运行并控制在典型运行模式(如需要带载荷,通常为额定</w:t>
       </w:r>
     </w:p>
     <w:p>
@@ -564,7 +841,57 @@
           <w:szCs w:val="21"/>
           <w:lang w:val="en-US" w:eastAsia="zh-CN"/>
         </w:rPr>
-        <w:t>工作模式3.3:系统/组件带电压UA和UNHV运行并控制在最小负载运行模式(如需要带载荷,通常为</w:t>
+        <w:t>工作模式3.3:系统/组件带电压U</w:t>
+      </w:r>
+      <w:r>
+        <w:rPr>
+          <w:rFonts w:hint="eastAsia" w:ascii="宋体" w:hAnsi="宋体" w:cs="宋体"/>
+          <w:b w:val="0"/>
+          <w:bCs/>
+          <w:color w:val="auto"/>
+          <w:sz w:val="21"/>
+          <w:szCs w:val="21"/>
+          <w:vertAlign w:val="subscript"/>
+          <w:lang w:val="en-US" w:eastAsia="zh-CN"/>
+        </w:rPr>
+        <w:t>A</w:t>
+      </w:r>
+      <w:r>
+        <w:rPr>
+          <w:rFonts w:hint="eastAsia" w:ascii="宋体" w:hAnsi="宋体" w:eastAsia="宋体" w:cs="宋体"/>
+          <w:b w:val="0"/>
+          <w:bCs/>
+          <w:color w:val="auto"/>
+          <w:sz w:val="21"/>
+          <w:szCs w:val="21"/>
+          <w:lang w:val="en-US" w:eastAsia="zh-CN"/>
+        </w:rPr>
+        <w:t>和U</w:t>
+      </w:r>
+      <w:r>
+        <w:rPr>
+          <w:rFonts w:hint="eastAsia" w:ascii="宋体" w:hAnsi="宋体" w:eastAsia="宋体" w:cs="宋体"/>
+          <w:b w:val="0"/>
+          <w:bCs/>
+          <w:color w:val="auto"/>
+          <w:sz w:val="21"/>
+          <w:szCs w:val="21"/>
+          <w:vertAlign w:val="subscript"/>
+          <w:lang w:val="en-US" w:eastAsia="zh-CN"/>
+        </w:rPr>
+        <w:t>NHV</w:t>
+      </w:r>
+      <w:r>
+        <w:rPr>
+          <w:rFonts w:hint="eastAsia" w:ascii="宋体" w:hAnsi="宋体" w:eastAsia="宋体" w:cs="宋体"/>
+          <w:b w:val="0"/>
+          <w:bCs/>
+          <w:color w:val="auto"/>
+          <w:sz w:val="21"/>
+          <w:szCs w:val="21"/>
+          <w:lang w:val="en-US" w:eastAsia="zh-CN"/>
+        </w:rPr>
+        <w:t>运行并控制在最小负载运行模式(如需要带载荷,通常为</w:t>
       </w:r>
     </w:p>
     <w:p>
@@ -616,7 +943,57 @@
           <w:szCs w:val="21"/>
           <w:lang w:val="en-US" w:eastAsia="zh-CN"/>
         </w:rPr>
-        <w:t>工作模式3.4:系统/组件带电压UA和UNHV运行并控制在最大负载运行模式(如需要带载荷,通常为</w:t>
+        <w:t>工作模式3.4:系统/组件带电压U</w:t>
+      </w:r>
+      <w:r>
+        <w:rPr>
+          <w:rFonts w:hint="eastAsia" w:ascii="宋体" w:hAnsi="宋体" w:cs="宋体"/>
+          <w:b w:val="0"/>
+          <w:bCs/>
+          <w:color w:val="auto"/>
+          <w:sz w:val="21"/>
+          <w:szCs w:val="21"/>
+          <w:vertAlign w:val="subscript"/>
+          <w:lang w:val="en-US" w:eastAsia="zh-CN"/>
+        </w:rPr>
+        <w:t>A</w:t>
+      </w:r>
+      <w:r>
+        <w:rPr>
+          <w:rFonts w:hint="eastAsia" w:ascii="宋体" w:hAnsi="宋体" w:eastAsia="宋体" w:cs="宋体"/>
+          <w:b w:val="0"/>
+          <w:bCs/>
+          <w:color w:val="auto"/>
+          <w:sz w:val="21"/>
+          <w:szCs w:val="21"/>
+          <w:lang w:val="en-US" w:eastAsia="zh-CN"/>
+        </w:rPr>
+        <w:t>和U</w:t>
+      </w:r>
+      <w:r>
+        <w:rPr>
+          <w:rFonts w:hint="eastAsia" w:ascii="宋体" w:hAnsi="宋体" w:eastAsia="宋体" w:cs="宋体"/>
+          <w:b w:val="0"/>
+          <w:bCs/>
+          <w:color w:val="auto"/>
+          <w:sz w:val="21"/>
+          <w:szCs w:val="21"/>
+          <w:vertAlign w:val="subscript"/>
+          <w:lang w:val="en-US" w:eastAsia="zh-CN"/>
+        </w:rPr>
+        <w:t>NHV</w:t>
+      </w:r>
+      <w:r>
+        <w:rPr>
+          <w:rFonts w:hint="eastAsia" w:ascii="宋体" w:hAnsi="宋体" w:eastAsia="宋体" w:cs="宋体"/>
+          <w:b w:val="0"/>
+          <w:bCs/>
+          <w:color w:val="auto"/>
+          <w:sz w:val="21"/>
+          <w:szCs w:val="21"/>
+          <w:lang w:val="en-US" w:eastAsia="zh-CN"/>
+        </w:rPr>
+        <w:t>运行并控制在最大负载运行模式(如需要带载荷,通常为</w:t>
       </w:r>
     </w:p>
     <w:p>
@@ -760,85 +1137,235 @@
           <w:szCs w:val="21"/>
           <w:lang w:val="en-US" w:eastAsia="zh-CN"/>
         </w:rPr>
-        <w:t>工作模式4 Operating Mode 4</w:t>
-      </w:r>
-    </w:p>
-    <w:p>
-      <w:pPr>
-        <w:spacing w:line="360" w:lineRule="auto"/>
-        <w:rPr>
-          <w:rFonts w:hint="eastAsia" w:ascii="宋体" w:hAnsi="宋体" w:eastAsia="宋体" w:cs="宋体"/>
-          <w:b w:val="0"/>
-          <w:bCs/>
-          <w:color w:val="auto"/>
-          <w:sz w:val="21"/>
-          <w:szCs w:val="21"/>
-          <w:lang w:val="en-US" w:eastAsia="zh-CN"/>
-        </w:rPr>
-      </w:pPr>
-      <w:r>
-        <w:rPr>
-          <w:rFonts w:hint="eastAsia" w:ascii="宋体" w:hAnsi="宋体" w:eastAsia="宋体" w:cs="宋体"/>
-          <w:b w:val="0"/>
-          <w:bCs/>
-          <w:color w:val="auto"/>
-          <w:sz w:val="21"/>
-          <w:szCs w:val="21"/>
-          <w:lang w:val="en-US" w:eastAsia="zh-CN"/>
-        </w:rPr>
-        <w:t>所有电气连接完好,零部件以电压UA和UNHV带电运行。并且安装了辅助设备(例如冷却系统)。</w:t>
-      </w:r>
-    </w:p>
-    <w:p>
-      <w:pPr>
-        <w:spacing w:line="360" w:lineRule="auto"/>
-        <w:rPr>
-          <w:rFonts w:hint="eastAsia" w:ascii="宋体" w:hAnsi="宋体" w:eastAsia="宋体" w:cs="宋体"/>
-          <w:b w:val="0"/>
-          <w:bCs/>
-          <w:color w:val="auto"/>
-          <w:sz w:val="21"/>
-          <w:szCs w:val="21"/>
-          <w:lang w:val="en-US" w:eastAsia="zh-CN"/>
-        </w:rPr>
-      </w:pPr>
-      <w:r>
-        <w:rPr>
-          <w:rFonts w:hint="eastAsia" w:ascii="宋体" w:hAnsi="宋体" w:eastAsia="宋体" w:cs="宋体"/>
-          <w:b w:val="0"/>
-          <w:bCs/>
-          <w:color w:val="auto"/>
-          <w:sz w:val="21"/>
-          <w:szCs w:val="21"/>
-          <w:lang w:val="en-US" w:eastAsia="zh-CN"/>
-        </w:rPr>
-        <w:t>工作模式4.1:系统/组件带电压UA和UNHv运行但功能不被激活。</w:t>
-      </w:r>
-    </w:p>
-    <w:p>
-      <w:pPr>
-        <w:spacing w:line="360" w:lineRule="auto"/>
-        <w:rPr>
-          <w:rFonts w:hint="eastAsia" w:ascii="宋体" w:hAnsi="宋体" w:eastAsia="宋体" w:cs="宋体"/>
-          <w:b w:val="0"/>
-          <w:bCs/>
-          <w:color w:val="auto"/>
-          <w:sz w:val="21"/>
-          <w:szCs w:val="21"/>
-          <w:lang w:val="en-US" w:eastAsia="zh-CN"/>
-        </w:rPr>
-      </w:pPr>
-      <w:r>
-        <w:rPr>
-          <w:rFonts w:hint="eastAsia" w:ascii="宋体" w:hAnsi="宋体" w:eastAsia="宋体" w:cs="宋体"/>
-          <w:b w:val="0"/>
-          <w:bCs/>
-          <w:color w:val="auto"/>
-          <w:sz w:val="21"/>
-          <w:szCs w:val="21"/>
-          <w:lang w:val="en-US" w:eastAsia="zh-CN"/>
-        </w:rPr>
-        <w:t>工作模式4.2:系统/组件带电压UA和UNHV行并控制在典型运行模式(如需要带载荷,通常为额定载</w:t>
+        <w:t xml:space="preserve">工作模式4 </w:t>
+      </w:r>
+    </w:p>
+    <w:p>
+      <w:pPr>
+        <w:spacing w:line="360" w:lineRule="auto"/>
+        <w:rPr>
+          <w:rFonts w:hint="eastAsia" w:ascii="宋体" w:hAnsi="宋体" w:eastAsia="宋体" w:cs="宋体"/>
+          <w:b w:val="0"/>
+          <w:bCs/>
+          <w:color w:val="auto"/>
+          <w:sz w:val="21"/>
+          <w:szCs w:val="21"/>
+          <w:lang w:val="en-US" w:eastAsia="zh-CN"/>
+        </w:rPr>
+      </w:pPr>
+      <w:r>
+        <w:rPr>
+          <w:rFonts w:hint="eastAsia" w:ascii="宋体" w:hAnsi="宋体" w:eastAsia="宋体" w:cs="宋体"/>
+          <w:b w:val="0"/>
+          <w:bCs/>
+          <w:color w:val="auto"/>
+          <w:sz w:val="21"/>
+          <w:szCs w:val="21"/>
+          <w:lang w:val="en-US" w:eastAsia="zh-CN"/>
+        </w:rPr>
+        <w:t>所有电气连接完好,零部件以电压U</w:t>
+      </w:r>
+      <w:r>
+        <w:rPr>
+          <w:rFonts w:hint="eastAsia" w:ascii="宋体" w:hAnsi="宋体" w:cs="宋体"/>
+          <w:b w:val="0"/>
+          <w:bCs/>
+          <w:color w:val="auto"/>
+          <w:sz w:val="21"/>
+          <w:szCs w:val="21"/>
+          <w:vertAlign w:val="subscript"/>
+          <w:lang w:val="en-US" w:eastAsia="zh-CN"/>
+        </w:rPr>
+        <w:t>A</w:t>
+      </w:r>
+      <w:r>
+        <w:rPr>
+          <w:rFonts w:hint="eastAsia" w:ascii="宋体" w:hAnsi="宋体" w:eastAsia="宋体" w:cs="宋体"/>
+          <w:b w:val="0"/>
+          <w:bCs/>
+          <w:color w:val="auto"/>
+          <w:sz w:val="21"/>
+          <w:szCs w:val="21"/>
+          <w:lang w:val="en-US" w:eastAsia="zh-CN"/>
+        </w:rPr>
+        <w:t>和U</w:t>
+      </w:r>
+      <w:r>
+        <w:rPr>
+          <w:rFonts w:hint="eastAsia" w:ascii="宋体" w:hAnsi="宋体" w:eastAsia="宋体" w:cs="宋体"/>
+          <w:b w:val="0"/>
+          <w:bCs/>
+          <w:color w:val="auto"/>
+          <w:sz w:val="21"/>
+          <w:szCs w:val="21"/>
+          <w:vertAlign w:val="subscript"/>
+          <w:lang w:val="en-US" w:eastAsia="zh-CN"/>
+        </w:rPr>
+        <w:t>NHV</w:t>
+      </w:r>
+      <w:r>
+        <w:rPr>
+          <w:rFonts w:hint="eastAsia" w:ascii="宋体" w:hAnsi="宋体" w:eastAsia="宋体" w:cs="宋体"/>
+          <w:b w:val="0"/>
+          <w:bCs/>
+          <w:color w:val="auto"/>
+          <w:sz w:val="21"/>
+          <w:szCs w:val="21"/>
+          <w:lang w:val="en-US" w:eastAsia="zh-CN"/>
+        </w:rPr>
+        <w:t>带电运行。并且安装了辅助设备(例如冷却系统)。</w:t>
+      </w:r>
+    </w:p>
+    <w:p>
+      <w:pPr>
+        <w:spacing w:line="360" w:lineRule="auto"/>
+        <w:rPr>
+          <w:rFonts w:hint="eastAsia" w:ascii="宋体" w:hAnsi="宋体" w:eastAsia="宋体" w:cs="宋体"/>
+          <w:b w:val="0"/>
+          <w:bCs/>
+          <w:color w:val="auto"/>
+          <w:sz w:val="21"/>
+          <w:szCs w:val="21"/>
+          <w:lang w:val="en-US" w:eastAsia="zh-CN"/>
+        </w:rPr>
+      </w:pPr>
+      <w:r>
+        <w:rPr>
+          <w:rFonts w:hint="eastAsia" w:ascii="宋体" w:hAnsi="宋体" w:eastAsia="宋体" w:cs="宋体"/>
+          <w:b w:val="0"/>
+          <w:bCs/>
+          <w:color w:val="auto"/>
+          <w:sz w:val="21"/>
+          <w:szCs w:val="21"/>
+          <w:lang w:val="en-US" w:eastAsia="zh-CN"/>
+        </w:rPr>
+        <w:t>工作模式4.1:系统/组件带电压U</w:t>
+      </w:r>
+      <w:r>
+        <w:rPr>
+          <w:rFonts w:hint="eastAsia" w:ascii="宋体" w:hAnsi="宋体" w:cs="宋体"/>
+          <w:b w:val="0"/>
+          <w:bCs/>
+          <w:color w:val="auto"/>
+          <w:sz w:val="21"/>
+          <w:szCs w:val="21"/>
+          <w:vertAlign w:val="subscript"/>
+          <w:lang w:val="en-US" w:eastAsia="zh-CN"/>
+        </w:rPr>
+        <w:t>A</w:t>
+      </w:r>
+      <w:r>
+        <w:rPr>
+          <w:rFonts w:hint="eastAsia" w:ascii="宋体" w:hAnsi="宋体" w:eastAsia="宋体" w:cs="宋体"/>
+          <w:b w:val="0"/>
+          <w:bCs/>
+          <w:color w:val="auto"/>
+          <w:sz w:val="21"/>
+          <w:szCs w:val="21"/>
+          <w:lang w:val="en-US" w:eastAsia="zh-CN"/>
+        </w:rPr>
+        <w:t>和U</w:t>
+      </w:r>
+      <w:r>
+        <w:rPr>
+          <w:rFonts w:hint="eastAsia" w:ascii="宋体" w:hAnsi="宋体" w:eastAsia="宋体" w:cs="宋体"/>
+          <w:b w:val="0"/>
+          <w:bCs/>
+          <w:color w:val="auto"/>
+          <w:sz w:val="21"/>
+          <w:szCs w:val="21"/>
+          <w:vertAlign w:val="subscript"/>
+          <w:lang w:val="en-US" w:eastAsia="zh-CN"/>
+        </w:rPr>
+        <w:t>NHV</w:t>
+      </w:r>
+      <w:r>
+        <w:rPr>
+          <w:rFonts w:hint="eastAsia" w:ascii="宋体" w:hAnsi="宋体" w:eastAsia="宋体" w:cs="宋体"/>
+          <w:b w:val="0"/>
+          <w:bCs/>
+          <w:color w:val="auto"/>
+          <w:sz w:val="21"/>
+          <w:szCs w:val="21"/>
+          <w:lang w:val="en-US" w:eastAsia="zh-CN"/>
+        </w:rPr>
+        <w:t>运行但功能不被激活。</w:t>
+      </w:r>
+    </w:p>
+    <w:p>
+      <w:pPr>
+        <w:spacing w:line="360" w:lineRule="auto"/>
+        <w:rPr>
+          <w:rFonts w:hint="eastAsia" w:ascii="宋体" w:hAnsi="宋体" w:eastAsia="宋体" w:cs="宋体"/>
+          <w:b w:val="0"/>
+          <w:bCs/>
+          <w:color w:val="auto"/>
+          <w:sz w:val="21"/>
+          <w:szCs w:val="21"/>
+          <w:lang w:val="en-US" w:eastAsia="zh-CN"/>
+        </w:rPr>
+      </w:pPr>
+      <w:r>
+        <w:rPr>
+          <w:rFonts w:hint="eastAsia" w:ascii="宋体" w:hAnsi="宋体" w:eastAsia="宋体" w:cs="宋体"/>
+          <w:b w:val="0"/>
+          <w:bCs/>
+          <w:color w:val="auto"/>
+          <w:sz w:val="21"/>
+          <w:szCs w:val="21"/>
+          <w:lang w:val="en-US" w:eastAsia="zh-CN"/>
+        </w:rPr>
+        <w:t>工作模式4.2:系统/组件带电压U</w:t>
+      </w:r>
+      <w:r>
+        <w:rPr>
+          <w:rFonts w:hint="eastAsia" w:ascii="宋体" w:hAnsi="宋体" w:cs="宋体"/>
+          <w:b w:val="0"/>
+          <w:bCs/>
+          <w:color w:val="auto"/>
+          <w:sz w:val="21"/>
+          <w:szCs w:val="21"/>
+          <w:vertAlign w:val="subscript"/>
+          <w:lang w:val="en-US" w:eastAsia="zh-CN"/>
+        </w:rPr>
+        <w:t>A</w:t>
+      </w:r>
+      <w:r>
+        <w:rPr>
+          <w:rFonts w:hint="eastAsia" w:ascii="宋体" w:hAnsi="宋体" w:eastAsia="宋体" w:cs="宋体"/>
+          <w:b w:val="0"/>
+          <w:bCs/>
+          <w:color w:val="auto"/>
+          <w:sz w:val="21"/>
+          <w:szCs w:val="21"/>
+          <w:lang w:val="en-US" w:eastAsia="zh-CN"/>
+        </w:rPr>
+        <w:t>和U</w:t>
+      </w:r>
+      <w:r>
+        <w:rPr>
+          <w:rFonts w:hint="eastAsia" w:ascii="宋体" w:hAnsi="宋体" w:eastAsia="宋体" w:cs="宋体"/>
+          <w:b w:val="0"/>
+          <w:bCs/>
+          <w:color w:val="auto"/>
+          <w:sz w:val="21"/>
+          <w:szCs w:val="21"/>
+          <w:vertAlign w:val="subscript"/>
+          <w:lang w:val="en-US" w:eastAsia="zh-CN"/>
+        </w:rPr>
+        <w:t>NHV</w:t>
+      </w:r>
+      <w:r>
+        <w:rPr>
+          <w:rFonts w:hint="eastAsia" w:ascii="宋体" w:hAnsi="宋体" w:eastAsia="宋体" w:cs="宋体"/>
+          <w:b w:val="0"/>
+          <w:bCs/>
+          <w:color w:val="auto"/>
+          <w:sz w:val="21"/>
+          <w:szCs w:val="21"/>
+          <w:lang w:val="en-US" w:eastAsia="zh-CN"/>
+        </w:rPr>
+        <w:t>行并控制在典型运行模式(如需要带载荷,通常为额定载</w:t>
       </w:r>
     </w:p>
     <w:p>
@@ -890,7 +1417,57 @@
           <w:szCs w:val="21"/>
           <w:lang w:val="en-US" w:eastAsia="zh-CN"/>
         </w:rPr>
-        <w:t>工作模式4.3:系统/组件带电压UA和UNHV行并控制在最小负载运行模式(如需要带载荷,通常为最</w:t>
+        <w:t>工作模式4.3:系统/组件带电压U</w:t>
+      </w:r>
+      <w:r>
+        <w:rPr>
+          <w:rFonts w:hint="eastAsia" w:ascii="宋体" w:hAnsi="宋体" w:cs="宋体"/>
+          <w:b w:val="0"/>
+          <w:bCs/>
+          <w:color w:val="auto"/>
+          <w:sz w:val="21"/>
+          <w:szCs w:val="21"/>
+          <w:vertAlign w:val="subscript"/>
+          <w:lang w:val="en-US" w:eastAsia="zh-CN"/>
+        </w:rPr>
+        <w:t>A</w:t>
+      </w:r>
+      <w:r>
+        <w:rPr>
+          <w:rFonts w:hint="eastAsia" w:ascii="宋体" w:hAnsi="宋体" w:eastAsia="宋体" w:cs="宋体"/>
+          <w:b w:val="0"/>
+          <w:bCs/>
+          <w:color w:val="auto"/>
+          <w:sz w:val="21"/>
+          <w:szCs w:val="21"/>
+          <w:lang w:val="en-US" w:eastAsia="zh-CN"/>
+        </w:rPr>
+        <w:t>和U</w:t>
+      </w:r>
+      <w:r>
+        <w:rPr>
+          <w:rFonts w:hint="eastAsia" w:ascii="宋体" w:hAnsi="宋体" w:eastAsia="宋体" w:cs="宋体"/>
+          <w:b w:val="0"/>
+          <w:bCs/>
+          <w:color w:val="auto"/>
+          <w:sz w:val="21"/>
+          <w:szCs w:val="21"/>
+          <w:vertAlign w:val="subscript"/>
+          <w:lang w:val="en-US" w:eastAsia="zh-CN"/>
+        </w:rPr>
+        <w:t>NHV</w:t>
+      </w:r>
+      <w:r>
+        <w:rPr>
+          <w:rFonts w:hint="eastAsia" w:ascii="宋体" w:hAnsi="宋体" w:eastAsia="宋体" w:cs="宋体"/>
+          <w:b w:val="0"/>
+          <w:bCs/>
+          <w:color w:val="auto"/>
+          <w:sz w:val="21"/>
+          <w:szCs w:val="21"/>
+          <w:lang w:val="en-US" w:eastAsia="zh-CN"/>
+        </w:rPr>
+        <w:t>行并控制在最小负载运行模式(如需要带载荷,通常为最</w:t>
       </w:r>
     </w:p>
     <w:p>
@@ -942,7 +1519,57 @@
           <w:szCs w:val="21"/>
           <w:lang w:val="en-US" w:eastAsia="zh-CN"/>
         </w:rPr>
-        <w:t>工作模式4.4:系统/组件带电压UA和UNHy运行并控制在最大负载运行模式(如需要带载荷,通常为</w:t>
+        <w:t>工作模式4.4:系统/组件带电压U</w:t>
+      </w:r>
+      <w:r>
+        <w:rPr>
+          <w:rFonts w:hint="eastAsia" w:ascii="宋体" w:hAnsi="宋体" w:cs="宋体"/>
+          <w:b w:val="0"/>
+          <w:bCs/>
+          <w:color w:val="auto"/>
+          <w:sz w:val="21"/>
+          <w:szCs w:val="21"/>
+          <w:vertAlign w:val="subscript"/>
+          <w:lang w:val="en-US" w:eastAsia="zh-CN"/>
+        </w:rPr>
+        <w:t>A</w:t>
+      </w:r>
+      <w:r>
+        <w:rPr>
+          <w:rFonts w:hint="eastAsia" w:ascii="宋体" w:hAnsi="宋体" w:eastAsia="宋体" w:cs="宋体"/>
+          <w:b w:val="0"/>
+          <w:bCs/>
+          <w:color w:val="auto"/>
+          <w:sz w:val="21"/>
+          <w:szCs w:val="21"/>
+          <w:lang w:val="en-US" w:eastAsia="zh-CN"/>
+        </w:rPr>
+        <w:t>和U</w:t>
+      </w:r>
+      <w:r>
+        <w:rPr>
+          <w:rFonts w:hint="eastAsia" w:ascii="宋体" w:hAnsi="宋体" w:eastAsia="宋体" w:cs="宋体"/>
+          <w:b w:val="0"/>
+          <w:bCs/>
+          <w:color w:val="auto"/>
+          <w:sz w:val="21"/>
+          <w:szCs w:val="21"/>
+          <w:vertAlign w:val="subscript"/>
+          <w:lang w:val="en-US" w:eastAsia="zh-CN"/>
+        </w:rPr>
+        <w:t>NHV</w:t>
+      </w:r>
+      <w:r>
+        <w:rPr>
+          <w:rFonts w:hint="eastAsia" w:ascii="宋体" w:hAnsi="宋体" w:eastAsia="宋体" w:cs="宋体"/>
+          <w:b w:val="0"/>
+          <w:bCs/>
+          <w:color w:val="auto"/>
+          <w:sz w:val="21"/>
+          <w:szCs w:val="21"/>
+          <w:lang w:val="en-US" w:eastAsia="zh-CN"/>
+        </w:rPr>
+        <w:t>运行并控制在最大负载运行模式(如需要带载荷,通常为</w:t>
       </w:r>
     </w:p>
     <w:p>
@@ -1110,8 +1737,6 @@
         </w:rPr>
         <w:t>● 功能状态分级</w:t>
       </w:r>
-      <w:bookmarkStart w:id="0" w:name="_GoBack"/>
-      <w:bookmarkEnd w:id="0"/>
     </w:p>
     <w:p>
       <w:pPr>
@@ -1464,7 +2089,7 @@
           <w:szCs w:val="21"/>
           <w:lang w:val="en-US" w:eastAsia="zh-CN"/>
         </w:rPr>
-        <w:t>直到人为操作重置,FSC A、B或C也可用于分类为FSC D的组件。e·</w:t>
+        <w:t>直到人为操作重置,FSC A、B或C也可用于分类为FSC D的组件。</w:t>
       </w:r>
     </w:p>
     <w:p>

</xml_diff>